<commit_message>
Commiting changes from friday
</commit_message>
<xml_diff>
--- a/Kriteria.docx
+++ b/Kriteria.docx
@@ -1071,7 +1071,7 @@
         <w:rPr>
           <w:sz w:val="28"/>
           <w:szCs w:val="28"/>
-          <w:highlight w:val="yellow"/>
+          <w:highlight w:val="green"/>
         </w:rPr>
         <w:t xml:space="preserve">1. </w:t>
       </w:r>
@@ -1080,7 +1080,7 @@
         <w:rPr>
           <w:sz w:val="28"/>
           <w:szCs w:val="28"/>
-          <w:highlight w:val="yellow"/>
+          <w:highlight w:val="green"/>
         </w:rPr>
         <w:t>Fehlende</w:t>
       </w:r>
@@ -1089,7 +1089,7 @@
         <w:rPr>
           <w:sz w:val="28"/>
           <w:szCs w:val="28"/>
-          <w:highlight w:val="yellow"/>
+          <w:highlight w:val="green"/>
         </w:rPr>
         <w:t xml:space="preserve"> und für die IPA </w:t>
       </w:r>
@@ -1098,7 +1098,7 @@
         <w:rPr>
           <w:sz w:val="28"/>
           <w:szCs w:val="28"/>
-          <w:highlight w:val="yellow"/>
+          <w:highlight w:val="green"/>
         </w:rPr>
         <w:t>relevante</w:t>
       </w:r>
@@ -1107,16 +1107,16 @@
         <w:rPr>
           <w:sz w:val="28"/>
           <w:szCs w:val="28"/>
-          <w:highlight w:val="yellow"/>
-        </w:rPr>
-        <w:t xml:space="preserve"> </w:t>
-      </w:r>
-      <w:proofErr w:type="spellStart"/>
-      <w:r>
-        <w:rPr>
-          <w:sz w:val="28"/>
-          <w:szCs w:val="28"/>
-          <w:highlight w:val="yellow"/>
+          <w:highlight w:val="green"/>
+        </w:rPr>
+        <w:t xml:space="preserve"> </w:t>
+      </w:r>
+      <w:proofErr w:type="spellStart"/>
+      <w:r>
+        <w:rPr>
+          <w:sz w:val="28"/>
+          <w:szCs w:val="28"/>
+          <w:highlight w:val="green"/>
         </w:rPr>
         <w:t>Informationen</w:t>
       </w:r>
@@ -1125,16 +1125,16 @@
         <w:rPr>
           <w:sz w:val="28"/>
           <w:szCs w:val="28"/>
-          <w:highlight w:val="yellow"/>
-        </w:rPr>
-        <w:t xml:space="preserve"> </w:t>
-      </w:r>
-      <w:proofErr w:type="spellStart"/>
-      <w:r>
-        <w:rPr>
-          <w:sz w:val="28"/>
-          <w:szCs w:val="28"/>
-          <w:highlight w:val="yellow"/>
+          <w:highlight w:val="green"/>
+        </w:rPr>
+        <w:t xml:space="preserve"> </w:t>
+      </w:r>
+      <w:proofErr w:type="spellStart"/>
+      <w:r>
+        <w:rPr>
+          <w:sz w:val="28"/>
+          <w:szCs w:val="28"/>
+          <w:highlight w:val="green"/>
         </w:rPr>
         <w:t>wurden</w:t>
       </w:r>
@@ -1143,16 +1143,16 @@
         <w:rPr>
           <w:sz w:val="28"/>
           <w:szCs w:val="28"/>
-          <w:highlight w:val="yellow"/>
-        </w:rPr>
-        <w:t xml:space="preserve"> </w:t>
-      </w:r>
-      <w:proofErr w:type="spellStart"/>
-      <w:r>
-        <w:rPr>
-          <w:sz w:val="28"/>
-          <w:szCs w:val="28"/>
-          <w:highlight w:val="yellow"/>
+          <w:highlight w:val="green"/>
+        </w:rPr>
+        <w:t xml:space="preserve"> </w:t>
+      </w:r>
+      <w:proofErr w:type="spellStart"/>
+      <w:r>
+        <w:rPr>
+          <w:sz w:val="28"/>
+          <w:szCs w:val="28"/>
+          <w:highlight w:val="green"/>
         </w:rPr>
         <w:t>identifiziert</w:t>
       </w:r>
@@ -1161,7 +1161,7 @@
         <w:rPr>
           <w:sz w:val="28"/>
           <w:szCs w:val="28"/>
-          <w:highlight w:val="yellow"/>
+          <w:highlight w:val="green"/>
         </w:rPr>
         <w:t xml:space="preserve"> und </w:t>
       </w:r>
@@ -1170,7 +1170,7 @@
         <w:rPr>
           <w:sz w:val="28"/>
           <w:szCs w:val="28"/>
-          <w:highlight w:val="yellow"/>
+          <w:highlight w:val="green"/>
         </w:rPr>
         <w:t>systematisch</w:t>
       </w:r>
@@ -1179,16 +1179,16 @@
         <w:rPr>
           <w:sz w:val="28"/>
           <w:szCs w:val="28"/>
-          <w:highlight w:val="yellow"/>
-        </w:rPr>
-        <w:t xml:space="preserve"> </w:t>
-      </w:r>
-      <w:proofErr w:type="spellStart"/>
-      <w:r>
-        <w:rPr>
-          <w:sz w:val="28"/>
-          <w:szCs w:val="28"/>
-          <w:highlight w:val="yellow"/>
+          <w:highlight w:val="green"/>
+        </w:rPr>
+        <w:t xml:space="preserve"> </w:t>
+      </w:r>
+      <w:proofErr w:type="spellStart"/>
+      <w:r>
+        <w:rPr>
+          <w:sz w:val="28"/>
+          <w:szCs w:val="28"/>
+          <w:highlight w:val="green"/>
         </w:rPr>
         <w:t>recherchiert</w:t>
       </w:r>
@@ -1197,7 +1197,7 @@
         <w:rPr>
           <w:sz w:val="28"/>
           <w:szCs w:val="28"/>
-          <w:highlight w:val="yellow"/>
+          <w:highlight w:val="green"/>
         </w:rPr>
         <w:t>.</w:t>
       </w:r>
@@ -2039,7 +2039,7 @@
         <w:rPr>
           <w:sz w:val="28"/>
           <w:szCs w:val="28"/>
-          <w:highlight w:val="yellow"/>
+          <w:highlight w:val="green"/>
         </w:rPr>
         <w:t xml:space="preserve">1. Die </w:t>
       </w:r>
@@ -2048,7 +2048,7 @@
         <w:rPr>
           <w:sz w:val="28"/>
           <w:szCs w:val="28"/>
-          <w:highlight w:val="yellow"/>
+          <w:highlight w:val="green"/>
         </w:rPr>
         <w:t>verwendeten</w:t>
       </w:r>
@@ -2057,16 +2057,16 @@
         <w:rPr>
           <w:sz w:val="28"/>
           <w:szCs w:val="28"/>
-          <w:highlight w:val="yellow"/>
-        </w:rPr>
-        <w:t xml:space="preserve"> </w:t>
-      </w:r>
-      <w:proofErr w:type="spellStart"/>
-      <w:r>
-        <w:rPr>
-          <w:sz w:val="28"/>
-          <w:szCs w:val="28"/>
-          <w:highlight w:val="yellow"/>
+          <w:highlight w:val="green"/>
+        </w:rPr>
+        <w:t xml:space="preserve"> </w:t>
+      </w:r>
+      <w:proofErr w:type="spellStart"/>
+      <w:r>
+        <w:rPr>
+          <w:sz w:val="28"/>
+          <w:szCs w:val="28"/>
+          <w:highlight w:val="green"/>
         </w:rPr>
         <w:t>Informationen</w:t>
       </w:r>
@@ -2075,16 +2075,16 @@
         <w:rPr>
           <w:sz w:val="28"/>
           <w:szCs w:val="28"/>
-          <w:highlight w:val="yellow"/>
-        </w:rPr>
-        <w:t xml:space="preserve"> </w:t>
-      </w:r>
-      <w:proofErr w:type="spellStart"/>
-      <w:r>
-        <w:rPr>
-          <w:sz w:val="28"/>
-          <w:szCs w:val="28"/>
-          <w:highlight w:val="yellow"/>
+          <w:highlight w:val="green"/>
+        </w:rPr>
+        <w:t xml:space="preserve"> </w:t>
+      </w:r>
+      <w:proofErr w:type="spellStart"/>
+      <w:r>
+        <w:rPr>
+          <w:sz w:val="28"/>
+          <w:szCs w:val="28"/>
+          <w:highlight w:val="green"/>
         </w:rPr>
         <w:t>finden</w:t>
       </w:r>
@@ -2093,7 +2093,7 @@
         <w:rPr>
           <w:sz w:val="28"/>
           <w:szCs w:val="28"/>
-          <w:highlight w:val="yellow"/>
+          <w:highlight w:val="green"/>
         </w:rPr>
         <w:t xml:space="preserve"> in </w:t>
       </w:r>
@@ -2102,7 +2102,7 @@
         <w:rPr>
           <w:sz w:val="28"/>
           <w:szCs w:val="28"/>
-          <w:highlight w:val="yellow"/>
+          <w:highlight w:val="green"/>
         </w:rPr>
         <w:t>einer</w:t>
       </w:r>
@@ -2111,16 +2111,16 @@
         <w:rPr>
           <w:sz w:val="28"/>
           <w:szCs w:val="28"/>
-          <w:highlight w:val="yellow"/>
-        </w:rPr>
-        <w:t xml:space="preserve"> </w:t>
-      </w:r>
-      <w:proofErr w:type="spellStart"/>
-      <w:r>
-        <w:rPr>
-          <w:sz w:val="28"/>
-          <w:szCs w:val="28"/>
-          <w:highlight w:val="yellow"/>
+          <w:highlight w:val="green"/>
+        </w:rPr>
+        <w:t xml:space="preserve"> </w:t>
+      </w:r>
+      <w:proofErr w:type="spellStart"/>
+      <w:r>
+        <w:rPr>
+          <w:sz w:val="28"/>
+          <w:szCs w:val="28"/>
+          <w:highlight w:val="green"/>
         </w:rPr>
         <w:t>klaren</w:t>
       </w:r>
@@ -2129,7 +2129,7 @@
         <w:rPr>
           <w:sz w:val="28"/>
           <w:szCs w:val="28"/>
-          <w:highlight w:val="yellow"/>
+          <w:highlight w:val="green"/>
         </w:rPr>
         <w:t xml:space="preserve"> und </w:t>
       </w:r>
@@ -2138,7 +2138,7 @@
         <w:rPr>
           <w:sz w:val="28"/>
           <w:szCs w:val="28"/>
-          <w:highlight w:val="yellow"/>
+          <w:highlight w:val="green"/>
         </w:rPr>
         <w:t>übersichtlichen</w:t>
       </w:r>
@@ -2147,16 +2147,16 @@
         <w:rPr>
           <w:sz w:val="28"/>
           <w:szCs w:val="28"/>
-          <w:highlight w:val="yellow"/>
-        </w:rPr>
-        <w:t xml:space="preserve"> </w:t>
-      </w:r>
-      <w:proofErr w:type="spellStart"/>
-      <w:r>
-        <w:rPr>
-          <w:sz w:val="28"/>
-          <w:szCs w:val="28"/>
-          <w:highlight w:val="yellow"/>
+          <w:highlight w:val="green"/>
+        </w:rPr>
+        <w:t xml:space="preserve"> </w:t>
+      </w:r>
+      <w:proofErr w:type="spellStart"/>
+      <w:r>
+        <w:rPr>
+          <w:sz w:val="28"/>
+          <w:szCs w:val="28"/>
+          <w:highlight w:val="green"/>
         </w:rPr>
         <w:t>Dokumentation</w:t>
       </w:r>
@@ -2165,16 +2165,16 @@
         <w:rPr>
           <w:sz w:val="28"/>
           <w:szCs w:val="28"/>
-          <w:highlight w:val="yellow"/>
-        </w:rPr>
-        <w:t xml:space="preserve"> </w:t>
-      </w:r>
-      <w:proofErr w:type="spellStart"/>
-      <w:r>
-        <w:rPr>
-          <w:sz w:val="28"/>
-          <w:szCs w:val="28"/>
-          <w:highlight w:val="yellow"/>
+          <w:highlight w:val="green"/>
+        </w:rPr>
+        <w:t xml:space="preserve"> </w:t>
+      </w:r>
+      <w:proofErr w:type="spellStart"/>
+      <w:r>
+        <w:rPr>
+          <w:sz w:val="28"/>
+          <w:szCs w:val="28"/>
+          <w:highlight w:val="green"/>
         </w:rPr>
         <w:t>Niederschlag</w:t>
       </w:r>
@@ -2183,7 +2183,7 @@
         <w:rPr>
           <w:sz w:val="28"/>
           <w:szCs w:val="28"/>
-          <w:highlight w:val="yellow"/>
+          <w:highlight w:val="green"/>
         </w:rPr>
         <w:t>.</w:t>
       </w:r>
@@ -2591,7 +2591,7 @@
         <w:rPr>
           <w:sz w:val="28"/>
           <w:szCs w:val="28"/>
-          <w:highlight w:val="yellow"/>
+          <w:highlight w:val="green"/>
         </w:rPr>
         <w:t xml:space="preserve">4. Alle </w:t>
       </w:r>
@@ -2600,7 +2600,7 @@
         <w:rPr>
           <w:sz w:val="28"/>
           <w:szCs w:val="28"/>
-          <w:highlight w:val="yellow"/>
+          <w:highlight w:val="green"/>
         </w:rPr>
         <w:t>verwendeten</w:t>
       </w:r>
@@ -2609,16 +2609,16 @@
         <w:rPr>
           <w:sz w:val="28"/>
           <w:szCs w:val="28"/>
-          <w:highlight w:val="yellow"/>
-        </w:rPr>
-        <w:t xml:space="preserve"> </w:t>
-      </w:r>
-      <w:proofErr w:type="spellStart"/>
-      <w:r>
-        <w:rPr>
-          <w:sz w:val="28"/>
-          <w:szCs w:val="28"/>
-          <w:highlight w:val="yellow"/>
+          <w:highlight w:val="green"/>
+        </w:rPr>
+        <w:t xml:space="preserve"> </w:t>
+      </w:r>
+      <w:proofErr w:type="spellStart"/>
+      <w:r>
+        <w:rPr>
+          <w:sz w:val="28"/>
+          <w:szCs w:val="28"/>
+          <w:highlight w:val="green"/>
         </w:rPr>
         <w:t>Informationen</w:t>
       </w:r>
@@ -2627,16 +2627,16 @@
         <w:rPr>
           <w:sz w:val="28"/>
           <w:szCs w:val="28"/>
-          <w:highlight w:val="yellow"/>
-        </w:rPr>
-        <w:t xml:space="preserve"> </w:t>
-      </w:r>
-      <w:proofErr w:type="spellStart"/>
-      <w:r>
-        <w:rPr>
-          <w:sz w:val="28"/>
-          <w:szCs w:val="28"/>
-          <w:highlight w:val="yellow"/>
+          <w:highlight w:val="green"/>
+        </w:rPr>
+        <w:t xml:space="preserve"> </w:t>
+      </w:r>
+      <w:proofErr w:type="spellStart"/>
+      <w:r>
+        <w:rPr>
+          <w:sz w:val="28"/>
+          <w:szCs w:val="28"/>
+          <w:highlight w:val="green"/>
         </w:rPr>
         <w:t>stehen</w:t>
       </w:r>
@@ -2645,16 +2645,16 @@
         <w:rPr>
           <w:sz w:val="28"/>
           <w:szCs w:val="28"/>
-          <w:highlight w:val="yellow"/>
-        </w:rPr>
-        <w:t xml:space="preserve"> </w:t>
-      </w:r>
-      <w:proofErr w:type="spellStart"/>
-      <w:r>
-        <w:rPr>
-          <w:sz w:val="28"/>
-          <w:szCs w:val="28"/>
-          <w:highlight w:val="yellow"/>
+          <w:highlight w:val="green"/>
+        </w:rPr>
+        <w:t xml:space="preserve"> </w:t>
+      </w:r>
+      <w:proofErr w:type="spellStart"/>
+      <w:r>
+        <w:rPr>
+          <w:sz w:val="28"/>
+          <w:szCs w:val="28"/>
+          <w:highlight w:val="green"/>
         </w:rPr>
         <w:t>im</w:t>
       </w:r>
@@ -2663,16 +2663,16 @@
         <w:rPr>
           <w:sz w:val="28"/>
           <w:szCs w:val="28"/>
-          <w:highlight w:val="yellow"/>
-        </w:rPr>
-        <w:t xml:space="preserve"> </w:t>
-      </w:r>
-      <w:proofErr w:type="spellStart"/>
-      <w:r>
-        <w:rPr>
-          <w:sz w:val="28"/>
-          <w:szCs w:val="28"/>
-          <w:highlight w:val="yellow"/>
+          <w:highlight w:val="green"/>
+        </w:rPr>
+        <w:t xml:space="preserve"> </w:t>
+      </w:r>
+      <w:proofErr w:type="spellStart"/>
+      <w:r>
+        <w:rPr>
+          <w:sz w:val="28"/>
+          <w:szCs w:val="28"/>
+          <w:highlight w:val="green"/>
         </w:rPr>
         <w:t>Auftragskontext</w:t>
       </w:r>
@@ -2681,7 +2681,7 @@
         <w:rPr>
           <w:sz w:val="28"/>
           <w:szCs w:val="28"/>
-          <w:highlight w:val="yellow"/>
+          <w:highlight w:val="green"/>
         </w:rPr>
         <w:t xml:space="preserve"> und </w:t>
       </w:r>
@@ -2690,7 +2690,7 @@
         <w:rPr>
           <w:sz w:val="28"/>
           <w:szCs w:val="28"/>
-          <w:highlight w:val="yellow"/>
+          <w:highlight w:val="green"/>
         </w:rPr>
         <w:t>finden</w:t>
       </w:r>
@@ -2699,16 +2699,16 @@
         <w:rPr>
           <w:sz w:val="28"/>
           <w:szCs w:val="28"/>
-          <w:highlight w:val="yellow"/>
-        </w:rPr>
-        <w:t xml:space="preserve"> </w:t>
-      </w:r>
-      <w:proofErr w:type="spellStart"/>
-      <w:r>
-        <w:rPr>
-          <w:sz w:val="28"/>
-          <w:szCs w:val="28"/>
-          <w:highlight w:val="yellow"/>
+          <w:highlight w:val="green"/>
+        </w:rPr>
+        <w:t xml:space="preserve"> </w:t>
+      </w:r>
+      <w:proofErr w:type="spellStart"/>
+      <w:r>
+        <w:rPr>
+          <w:sz w:val="28"/>
+          <w:szCs w:val="28"/>
+          <w:highlight w:val="green"/>
         </w:rPr>
         <w:t>im</w:t>
       </w:r>
@@ -2717,7 +2717,7 @@
         <w:rPr>
           <w:sz w:val="28"/>
           <w:szCs w:val="28"/>
-          <w:highlight w:val="yellow"/>
+          <w:highlight w:val="green"/>
         </w:rPr>
         <w:t xml:space="preserve"> Projekt </w:t>
       </w:r>
@@ -2726,7 +2726,7 @@
         <w:rPr>
           <w:sz w:val="28"/>
           <w:szCs w:val="28"/>
-          <w:highlight w:val="yellow"/>
+          <w:highlight w:val="green"/>
         </w:rPr>
         <w:t>sinnvolle</w:t>
       </w:r>
@@ -2735,16 +2735,16 @@
         <w:rPr>
           <w:sz w:val="28"/>
           <w:szCs w:val="28"/>
-          <w:highlight w:val="yellow"/>
-        </w:rPr>
-        <w:t xml:space="preserve"> </w:t>
-      </w:r>
-      <w:proofErr w:type="spellStart"/>
-      <w:r>
-        <w:rPr>
-          <w:sz w:val="28"/>
-          <w:szCs w:val="28"/>
-          <w:highlight w:val="yellow"/>
+          <w:highlight w:val="green"/>
+        </w:rPr>
+        <w:t xml:space="preserve"> </w:t>
+      </w:r>
+      <w:proofErr w:type="spellStart"/>
+      <w:r>
+        <w:rPr>
+          <w:sz w:val="28"/>
+          <w:szCs w:val="28"/>
+          <w:highlight w:val="green"/>
         </w:rPr>
         <w:t>Anwendung</w:t>
       </w:r>
@@ -2753,7 +2753,7 @@
         <w:rPr>
           <w:sz w:val="28"/>
           <w:szCs w:val="28"/>
-          <w:highlight w:val="yellow"/>
+          <w:highlight w:val="green"/>
         </w:rPr>
         <w:t>.</w:t>
       </w:r>
@@ -7813,7 +7813,7 @@
         <w:rPr>
           <w:sz w:val="28"/>
           <w:szCs w:val="28"/>
-          <w:highlight w:val="yellow"/>
+          <w:highlight w:val="red"/>
         </w:rPr>
         <w:t xml:space="preserve">3. Der </w:t>
       </w:r>
@@ -7822,7 +7822,7 @@
         <w:rPr>
           <w:sz w:val="28"/>
           <w:szCs w:val="28"/>
-          <w:highlight w:val="yellow"/>
+          <w:highlight w:val="red"/>
         </w:rPr>
         <w:t>Anspruch</w:t>
       </w:r>
@@ -7831,7 +7831,7 @@
         <w:rPr>
           <w:sz w:val="28"/>
           <w:szCs w:val="28"/>
-          <w:highlight w:val="yellow"/>
+          <w:highlight w:val="red"/>
         </w:rPr>
         <w:t xml:space="preserve"> der </w:t>
       </w:r>
@@ -7840,7 +7840,7 @@
         <w:rPr>
           <w:sz w:val="28"/>
           <w:szCs w:val="28"/>
-          <w:highlight w:val="yellow"/>
+          <w:highlight w:val="red"/>
         </w:rPr>
         <w:t>Transferleistung</w:t>
       </w:r>
@@ -7849,16 +7849,16 @@
         <w:rPr>
           <w:sz w:val="28"/>
           <w:szCs w:val="28"/>
-          <w:highlight w:val="yellow"/>
-        </w:rPr>
-        <w:t xml:space="preserve"> </w:t>
-      </w:r>
-      <w:proofErr w:type="spellStart"/>
-      <w:r>
-        <w:rPr>
-          <w:sz w:val="28"/>
-          <w:szCs w:val="28"/>
-          <w:highlight w:val="yellow"/>
+          <w:highlight w:val="red"/>
+        </w:rPr>
+        <w:t xml:space="preserve"> </w:t>
+      </w:r>
+      <w:proofErr w:type="spellStart"/>
+      <w:r>
+        <w:rPr>
+          <w:sz w:val="28"/>
+          <w:szCs w:val="28"/>
+          <w:highlight w:val="red"/>
         </w:rPr>
         <w:t>ist</w:t>
       </w:r>
@@ -7867,16 +7867,16 @@
         <w:rPr>
           <w:sz w:val="28"/>
           <w:szCs w:val="28"/>
-          <w:highlight w:val="yellow"/>
-        </w:rPr>
-        <w:t xml:space="preserve"> </w:t>
-      </w:r>
-      <w:proofErr w:type="spellStart"/>
-      <w:r>
-        <w:rPr>
-          <w:sz w:val="28"/>
-          <w:szCs w:val="28"/>
-          <w:highlight w:val="yellow"/>
+          <w:highlight w:val="red"/>
+        </w:rPr>
+        <w:t xml:space="preserve"> </w:t>
+      </w:r>
+      <w:proofErr w:type="spellStart"/>
+      <w:r>
+        <w:rPr>
+          <w:sz w:val="28"/>
+          <w:szCs w:val="28"/>
+          <w:highlight w:val="red"/>
         </w:rPr>
         <w:t>erfüllt</w:t>
       </w:r>
@@ -7885,7 +7885,7 @@
         <w:rPr>
           <w:sz w:val="28"/>
           <w:szCs w:val="28"/>
-          <w:highlight w:val="yellow"/>
+          <w:highlight w:val="red"/>
         </w:rPr>
         <w:t xml:space="preserve">, da </w:t>
       </w:r>
@@ -7894,7 +7894,7 @@
         <w:rPr>
           <w:sz w:val="28"/>
           <w:szCs w:val="28"/>
-          <w:highlight w:val="yellow"/>
+          <w:highlight w:val="red"/>
         </w:rPr>
         <w:t>Fähigkeiten</w:t>
       </w:r>
@@ -7903,7 +7903,7 @@
         <w:rPr>
           <w:sz w:val="28"/>
           <w:szCs w:val="28"/>
-          <w:highlight w:val="yellow"/>
+          <w:highlight w:val="red"/>
         </w:rPr>
         <w:t xml:space="preserve"> und </w:t>
       </w:r>
@@ -7912,7 +7912,7 @@
         <w:rPr>
           <w:sz w:val="28"/>
           <w:szCs w:val="28"/>
-          <w:highlight w:val="yellow"/>
+          <w:highlight w:val="red"/>
         </w:rPr>
         <w:t>Kenntnisse</w:t>
       </w:r>
@@ -7921,7 +7921,7 @@
         <w:rPr>
           <w:sz w:val="28"/>
           <w:szCs w:val="28"/>
-          <w:highlight w:val="yellow"/>
+          <w:highlight w:val="red"/>
         </w:rPr>
         <w:t xml:space="preserve"> auf </w:t>
       </w:r>
@@ -7930,7 +7930,7 @@
         <w:rPr>
           <w:sz w:val="28"/>
           <w:szCs w:val="28"/>
-          <w:highlight w:val="yellow"/>
+          <w:highlight w:val="red"/>
         </w:rPr>
         <w:t>unerwartete</w:t>
       </w:r>
@@ -7939,16 +7939,16 @@
         <w:rPr>
           <w:sz w:val="28"/>
           <w:szCs w:val="28"/>
-          <w:highlight w:val="yellow"/>
-        </w:rPr>
-        <w:t xml:space="preserve"> </w:t>
-      </w:r>
-      <w:proofErr w:type="spellStart"/>
-      <w:r>
-        <w:rPr>
-          <w:sz w:val="28"/>
-          <w:szCs w:val="28"/>
-          <w:highlight w:val="yellow"/>
+          <w:highlight w:val="red"/>
+        </w:rPr>
+        <w:t xml:space="preserve"> </w:t>
+      </w:r>
+      <w:proofErr w:type="spellStart"/>
+      <w:r>
+        <w:rPr>
+          <w:sz w:val="28"/>
+          <w:szCs w:val="28"/>
+          <w:highlight w:val="red"/>
         </w:rPr>
         <w:t>oder</w:t>
       </w:r>
@@ -7957,16 +7957,16 @@
         <w:rPr>
           <w:sz w:val="28"/>
           <w:szCs w:val="28"/>
-          <w:highlight w:val="yellow"/>
-        </w:rPr>
-        <w:t xml:space="preserve"> </w:t>
-      </w:r>
-      <w:proofErr w:type="spellStart"/>
-      <w:r>
-        <w:rPr>
-          <w:sz w:val="28"/>
-          <w:szCs w:val="28"/>
-          <w:highlight w:val="yellow"/>
+          <w:highlight w:val="red"/>
+        </w:rPr>
+        <w:t xml:space="preserve"> </w:t>
+      </w:r>
+      <w:proofErr w:type="spellStart"/>
+      <w:r>
+        <w:rPr>
+          <w:sz w:val="28"/>
+          <w:szCs w:val="28"/>
+          <w:highlight w:val="red"/>
         </w:rPr>
         <w:t>neuartige</w:t>
       </w:r>
@@ -7975,16 +7975,16 @@
         <w:rPr>
           <w:sz w:val="28"/>
           <w:szCs w:val="28"/>
-          <w:highlight w:val="yellow"/>
-        </w:rPr>
-        <w:t xml:space="preserve"> </w:t>
-      </w:r>
-      <w:proofErr w:type="spellStart"/>
-      <w:r>
-        <w:rPr>
-          <w:sz w:val="28"/>
-          <w:szCs w:val="28"/>
-          <w:highlight w:val="yellow"/>
+          <w:highlight w:val="red"/>
+        </w:rPr>
+        <w:t xml:space="preserve"> </w:t>
+      </w:r>
+      <w:proofErr w:type="spellStart"/>
+      <w:r>
+        <w:rPr>
+          <w:sz w:val="28"/>
+          <w:szCs w:val="28"/>
+          <w:highlight w:val="red"/>
         </w:rPr>
         <w:t>Aufgabenstellungen</w:t>
       </w:r>
@@ -7993,16 +7993,16 @@
         <w:rPr>
           <w:sz w:val="28"/>
           <w:szCs w:val="28"/>
-          <w:highlight w:val="yellow"/>
-        </w:rPr>
-        <w:t xml:space="preserve"> </w:t>
-      </w:r>
-      <w:proofErr w:type="spellStart"/>
-      <w:r>
-        <w:rPr>
-          <w:sz w:val="28"/>
-          <w:szCs w:val="28"/>
-          <w:highlight w:val="yellow"/>
+          <w:highlight w:val="red"/>
+        </w:rPr>
+        <w:t xml:space="preserve"> </w:t>
+      </w:r>
+      <w:proofErr w:type="spellStart"/>
+      <w:r>
+        <w:rPr>
+          <w:sz w:val="28"/>
+          <w:szCs w:val="28"/>
+          <w:highlight w:val="red"/>
         </w:rPr>
         <w:t>angewandt</w:t>
       </w:r>
@@ -8011,16 +8011,16 @@
         <w:rPr>
           <w:sz w:val="28"/>
           <w:szCs w:val="28"/>
-          <w:highlight w:val="yellow"/>
-        </w:rPr>
-        <w:t xml:space="preserve"> </w:t>
-      </w:r>
-      <w:proofErr w:type="spellStart"/>
-      <w:r>
-        <w:rPr>
-          <w:sz w:val="28"/>
-          <w:szCs w:val="28"/>
-          <w:highlight w:val="yellow"/>
+          <w:highlight w:val="red"/>
+        </w:rPr>
+        <w:t xml:space="preserve"> </w:t>
+      </w:r>
+      <w:proofErr w:type="spellStart"/>
+      <w:r>
+        <w:rPr>
+          <w:sz w:val="28"/>
+          <w:szCs w:val="28"/>
+          <w:highlight w:val="red"/>
         </w:rPr>
         <w:t>wurden</w:t>
       </w:r>
@@ -8029,7 +8029,7 @@
         <w:rPr>
           <w:sz w:val="28"/>
           <w:szCs w:val="28"/>
-          <w:highlight w:val="yellow"/>
+          <w:highlight w:val="red"/>
         </w:rPr>
         <w:t>.</w:t>
       </w:r>
@@ -8723,7 +8723,7 @@
         <w:rPr>
           <w:sz w:val="28"/>
           <w:szCs w:val="28"/>
-          <w:highlight w:val="red"/>
+          <w:highlight w:val="green"/>
         </w:rPr>
         <w:t xml:space="preserve">2. </w:t>
       </w:r>
@@ -8732,7 +8732,7 @@
         <w:rPr>
           <w:sz w:val="28"/>
           <w:szCs w:val="28"/>
-          <w:highlight w:val="red"/>
+          <w:highlight w:val="green"/>
         </w:rPr>
         <w:t>Rückmeldungen</w:t>
       </w:r>
@@ -8741,16 +8741,16 @@
         <w:rPr>
           <w:sz w:val="28"/>
           <w:szCs w:val="28"/>
-          <w:highlight w:val="red"/>
-        </w:rPr>
-        <w:t xml:space="preserve"> </w:t>
-      </w:r>
-      <w:proofErr w:type="spellStart"/>
-      <w:r>
-        <w:rPr>
-          <w:sz w:val="28"/>
-          <w:szCs w:val="28"/>
-          <w:highlight w:val="red"/>
+          <w:highlight w:val="green"/>
+        </w:rPr>
+        <w:t xml:space="preserve"> </w:t>
+      </w:r>
+      <w:proofErr w:type="spellStart"/>
+      <w:r>
+        <w:rPr>
+          <w:sz w:val="28"/>
+          <w:szCs w:val="28"/>
+          <w:highlight w:val="green"/>
         </w:rPr>
         <w:t>oder</w:t>
       </w:r>
@@ -8759,16 +8759,16 @@
         <w:rPr>
           <w:sz w:val="28"/>
           <w:szCs w:val="28"/>
-          <w:highlight w:val="red"/>
-        </w:rPr>
-        <w:t xml:space="preserve"> </w:t>
-      </w:r>
-      <w:proofErr w:type="spellStart"/>
-      <w:r>
-        <w:rPr>
-          <w:sz w:val="28"/>
-          <w:szCs w:val="28"/>
-          <w:highlight w:val="red"/>
+          <w:highlight w:val="green"/>
+        </w:rPr>
+        <w:t xml:space="preserve"> </w:t>
+      </w:r>
+      <w:proofErr w:type="spellStart"/>
+      <w:r>
+        <w:rPr>
+          <w:sz w:val="28"/>
+          <w:szCs w:val="28"/>
+          <w:highlight w:val="green"/>
         </w:rPr>
         <w:t>Vorgaben</w:t>
       </w:r>
@@ -8777,16 +8777,16 @@
         <w:rPr>
           <w:sz w:val="28"/>
           <w:szCs w:val="28"/>
-          <w:highlight w:val="red"/>
-        </w:rPr>
-        <w:t xml:space="preserve"> </w:t>
-      </w:r>
-      <w:proofErr w:type="spellStart"/>
-      <w:r>
-        <w:rPr>
-          <w:sz w:val="28"/>
-          <w:szCs w:val="28"/>
-          <w:highlight w:val="red"/>
+          <w:highlight w:val="green"/>
+        </w:rPr>
+        <w:t xml:space="preserve"> </w:t>
+      </w:r>
+      <w:proofErr w:type="spellStart"/>
+      <w:r>
+        <w:rPr>
+          <w:sz w:val="28"/>
+          <w:szCs w:val="28"/>
+          <w:highlight w:val="green"/>
         </w:rPr>
         <w:t>wurden</w:t>
       </w:r>
@@ -8795,16 +8795,16 @@
         <w:rPr>
           <w:sz w:val="28"/>
           <w:szCs w:val="28"/>
-          <w:highlight w:val="red"/>
-        </w:rPr>
-        <w:t xml:space="preserve"> </w:t>
-      </w:r>
-      <w:proofErr w:type="spellStart"/>
-      <w:r>
-        <w:rPr>
-          <w:sz w:val="28"/>
-          <w:szCs w:val="28"/>
-          <w:highlight w:val="red"/>
+          <w:highlight w:val="green"/>
+        </w:rPr>
+        <w:t xml:space="preserve"> </w:t>
+      </w:r>
+      <w:proofErr w:type="spellStart"/>
+      <w:r>
+        <w:rPr>
+          <w:sz w:val="28"/>
+          <w:szCs w:val="28"/>
+          <w:highlight w:val="green"/>
         </w:rPr>
         <w:t>nachvollziehbar</w:t>
       </w:r>
@@ -8813,16 +8813,16 @@
         <w:rPr>
           <w:sz w:val="28"/>
           <w:szCs w:val="28"/>
-          <w:highlight w:val="red"/>
-        </w:rPr>
-        <w:t xml:space="preserve"> </w:t>
-      </w:r>
-      <w:proofErr w:type="spellStart"/>
-      <w:r>
-        <w:rPr>
-          <w:sz w:val="28"/>
-          <w:szCs w:val="28"/>
-          <w:highlight w:val="red"/>
+          <w:highlight w:val="green"/>
+        </w:rPr>
+        <w:t xml:space="preserve"> </w:t>
+      </w:r>
+      <w:proofErr w:type="spellStart"/>
+      <w:r>
+        <w:rPr>
+          <w:sz w:val="28"/>
+          <w:szCs w:val="28"/>
+          <w:highlight w:val="green"/>
         </w:rPr>
         <w:t>umgesetzt</w:t>
       </w:r>
@@ -8831,7 +8831,7 @@
         <w:rPr>
           <w:sz w:val="28"/>
           <w:szCs w:val="28"/>
-          <w:highlight w:val="red"/>
+          <w:highlight w:val="green"/>
         </w:rPr>
         <w:t xml:space="preserve"> und </w:t>
       </w:r>
@@ -8840,7 +8840,7 @@
         <w:rPr>
           <w:sz w:val="28"/>
           <w:szCs w:val="28"/>
-          <w:highlight w:val="red"/>
+          <w:highlight w:val="green"/>
         </w:rPr>
         <w:t>im</w:t>
       </w:r>
@@ -8849,16 +8849,16 @@
         <w:rPr>
           <w:sz w:val="28"/>
           <w:szCs w:val="28"/>
-          <w:highlight w:val="red"/>
-        </w:rPr>
-        <w:t xml:space="preserve"> </w:t>
-      </w:r>
-      <w:proofErr w:type="spellStart"/>
-      <w:r>
-        <w:rPr>
-          <w:sz w:val="28"/>
-          <w:szCs w:val="28"/>
-          <w:highlight w:val="red"/>
+          <w:highlight w:val="green"/>
+        </w:rPr>
+        <w:t xml:space="preserve"> </w:t>
+      </w:r>
+      <w:proofErr w:type="spellStart"/>
+      <w:r>
+        <w:rPr>
+          <w:sz w:val="28"/>
+          <w:szCs w:val="28"/>
+          <w:highlight w:val="green"/>
         </w:rPr>
         <w:t>Projektbericht</w:t>
       </w:r>
@@ -8867,16 +8867,16 @@
         <w:rPr>
           <w:sz w:val="28"/>
           <w:szCs w:val="28"/>
-          <w:highlight w:val="red"/>
-        </w:rPr>
-        <w:t xml:space="preserve"> </w:t>
-      </w:r>
-      <w:proofErr w:type="spellStart"/>
-      <w:r>
-        <w:rPr>
-          <w:sz w:val="28"/>
-          <w:szCs w:val="28"/>
-          <w:highlight w:val="red"/>
+          <w:highlight w:val="green"/>
+        </w:rPr>
+        <w:t xml:space="preserve"> </w:t>
+      </w:r>
+      <w:proofErr w:type="spellStart"/>
+      <w:r>
+        <w:rPr>
+          <w:sz w:val="28"/>
+          <w:szCs w:val="28"/>
+          <w:highlight w:val="green"/>
         </w:rPr>
         <w:t>nachgewiesen</w:t>
       </w:r>
@@ -8885,7 +8885,7 @@
         <w:rPr>
           <w:sz w:val="28"/>
           <w:szCs w:val="28"/>
-          <w:highlight w:val="red"/>
+          <w:highlight w:val="green"/>
         </w:rPr>
         <w:t>.</w:t>
       </w:r>
@@ -10478,14 +10478,14 @@
         <w:rPr>
           <w:sz w:val="28"/>
           <w:szCs w:val="28"/>
-          <w:highlight w:val="yellow"/>
-        </w:rPr>
-      </w:pPr>
-      <w:r>
-        <w:rPr>
-          <w:sz w:val="28"/>
-          <w:szCs w:val="28"/>
-          <w:highlight w:val="yellow"/>
+          <w:highlight w:val="green"/>
+        </w:rPr>
+      </w:pPr>
+      <w:r>
+        <w:rPr>
+          <w:sz w:val="28"/>
+          <w:szCs w:val="28"/>
+          <w:highlight w:val="green"/>
         </w:rPr>
         <w:t xml:space="preserve">1. Es </w:t>
       </w:r>
@@ -10494,7 +10494,7 @@
         <w:rPr>
           <w:sz w:val="28"/>
           <w:szCs w:val="28"/>
-          <w:highlight w:val="yellow"/>
+          <w:highlight w:val="green"/>
         </w:rPr>
         <w:t>wurde</w:t>
       </w:r>
@@ -10503,16 +10503,16 @@
         <w:rPr>
           <w:sz w:val="28"/>
           <w:szCs w:val="28"/>
-          <w:highlight w:val="yellow"/>
-        </w:rPr>
-        <w:t xml:space="preserve"> </w:t>
-      </w:r>
-      <w:proofErr w:type="spellStart"/>
-      <w:r>
-        <w:rPr>
-          <w:sz w:val="28"/>
-          <w:szCs w:val="28"/>
-          <w:highlight w:val="yellow"/>
+          <w:highlight w:val="green"/>
+        </w:rPr>
+        <w:t xml:space="preserve"> </w:t>
+      </w:r>
+      <w:proofErr w:type="spellStart"/>
+      <w:r>
+        <w:rPr>
+          <w:sz w:val="28"/>
+          <w:szCs w:val="28"/>
+          <w:highlight w:val="green"/>
         </w:rPr>
         <w:t>eine</w:t>
       </w:r>
@@ -10521,16 +10521,16 @@
         <w:rPr>
           <w:sz w:val="28"/>
           <w:szCs w:val="28"/>
-          <w:highlight w:val="yellow"/>
-        </w:rPr>
-        <w:t xml:space="preserve"> </w:t>
-      </w:r>
-      <w:proofErr w:type="spellStart"/>
-      <w:r>
-        <w:rPr>
-          <w:sz w:val="28"/>
-          <w:szCs w:val="28"/>
-          <w:highlight w:val="yellow"/>
+          <w:highlight w:val="green"/>
+        </w:rPr>
+        <w:t xml:space="preserve"> </w:t>
+      </w:r>
+      <w:proofErr w:type="spellStart"/>
+      <w:r>
+        <w:rPr>
+          <w:sz w:val="28"/>
+          <w:szCs w:val="28"/>
+          <w:highlight w:val="green"/>
         </w:rPr>
         <w:t>Beschreibung</w:t>
       </w:r>
@@ -10539,7 +10539,7 @@
         <w:rPr>
           <w:sz w:val="28"/>
           <w:szCs w:val="28"/>
-          <w:highlight w:val="yellow"/>
+          <w:highlight w:val="green"/>
         </w:rPr>
         <w:t xml:space="preserve"> der </w:t>
       </w:r>
@@ -10548,7 +10548,7 @@
         <w:rPr>
           <w:sz w:val="28"/>
           <w:szCs w:val="28"/>
-          <w:highlight w:val="yellow"/>
+          <w:highlight w:val="green"/>
         </w:rPr>
         <w:t>Testinfrastruktur</w:t>
       </w:r>
@@ -10557,7 +10557,7 @@
         <w:rPr>
           <w:sz w:val="28"/>
           <w:szCs w:val="28"/>
-          <w:highlight w:val="yellow"/>
+          <w:highlight w:val="green"/>
         </w:rPr>
         <w:t xml:space="preserve"> und des </w:t>
       </w:r>
@@ -10566,7 +10566,7 @@
         <w:rPr>
           <w:sz w:val="28"/>
           <w:szCs w:val="28"/>
-          <w:highlight w:val="yellow"/>
+          <w:highlight w:val="green"/>
         </w:rPr>
         <w:t>Umfelds</w:t>
       </w:r>
@@ -10575,16 +10575,16 @@
         <w:rPr>
           <w:sz w:val="28"/>
           <w:szCs w:val="28"/>
-          <w:highlight w:val="yellow"/>
-        </w:rPr>
-        <w:t xml:space="preserve"> </w:t>
-      </w:r>
-      <w:proofErr w:type="spellStart"/>
-      <w:r>
-        <w:rPr>
-          <w:sz w:val="28"/>
-          <w:szCs w:val="28"/>
-          <w:highlight w:val="yellow"/>
+          <w:highlight w:val="green"/>
+        </w:rPr>
+        <w:t xml:space="preserve"> </w:t>
+      </w:r>
+      <w:proofErr w:type="spellStart"/>
+      <w:r>
+        <w:rPr>
+          <w:sz w:val="28"/>
+          <w:szCs w:val="28"/>
+          <w:highlight w:val="green"/>
         </w:rPr>
         <w:t>bereitgestellt</w:t>
       </w:r>
@@ -10593,7 +10593,7 @@
         <w:rPr>
           <w:sz w:val="28"/>
           <w:szCs w:val="28"/>
-          <w:highlight w:val="yellow"/>
+          <w:highlight w:val="green"/>
         </w:rPr>
         <w:t xml:space="preserve">, </w:t>
       </w:r>
@@ -10602,7 +10602,7 @@
         <w:rPr>
           <w:sz w:val="28"/>
           <w:szCs w:val="28"/>
-          <w:highlight w:val="yellow"/>
+          <w:highlight w:val="green"/>
         </w:rPr>
         <w:t>sodass</w:t>
       </w:r>
@@ -10611,16 +10611,16 @@
         <w:rPr>
           <w:sz w:val="28"/>
           <w:szCs w:val="28"/>
-          <w:highlight w:val="yellow"/>
-        </w:rPr>
-        <w:t xml:space="preserve"> </w:t>
-      </w:r>
-      <w:proofErr w:type="spellStart"/>
-      <w:r>
-        <w:rPr>
-          <w:sz w:val="28"/>
-          <w:szCs w:val="28"/>
-          <w:highlight w:val="yellow"/>
+          <w:highlight w:val="green"/>
+        </w:rPr>
+        <w:t xml:space="preserve"> </w:t>
+      </w:r>
+      <w:proofErr w:type="spellStart"/>
+      <w:r>
+        <w:rPr>
+          <w:sz w:val="28"/>
+          <w:szCs w:val="28"/>
+          <w:highlight w:val="green"/>
         </w:rPr>
         <w:t>eine</w:t>
       </w:r>
@@ -10629,7 +10629,7 @@
         <w:rPr>
           <w:sz w:val="28"/>
           <w:szCs w:val="28"/>
-          <w:highlight w:val="yellow"/>
+          <w:highlight w:val="green"/>
         </w:rPr>
         <w:t xml:space="preserve"> externe </w:t>
       </w:r>
@@ -10638,7 +10638,7 @@
         <w:rPr>
           <w:sz w:val="28"/>
           <w:szCs w:val="28"/>
-          <w:highlight w:val="yellow"/>
+          <w:highlight w:val="green"/>
         </w:rPr>
         <w:t>Fachperson</w:t>
       </w:r>
@@ -10647,7 +10647,7 @@
         <w:rPr>
           <w:sz w:val="28"/>
           <w:szCs w:val="28"/>
-          <w:highlight w:val="yellow"/>
+          <w:highlight w:val="green"/>
         </w:rPr>
         <w:t xml:space="preserve"> die Tests </w:t>
       </w:r>
@@ -10656,7 +10656,7 @@
         <w:rPr>
           <w:sz w:val="28"/>
           <w:szCs w:val="28"/>
-          <w:highlight w:val="yellow"/>
+          <w:highlight w:val="green"/>
         </w:rPr>
         <w:t>mit</w:t>
       </w:r>
@@ -10665,16 +10665,16 @@
         <w:rPr>
           <w:sz w:val="28"/>
           <w:szCs w:val="28"/>
-          <w:highlight w:val="yellow"/>
-        </w:rPr>
-        <w:t xml:space="preserve"> </w:t>
-      </w:r>
-      <w:proofErr w:type="spellStart"/>
-      <w:r>
-        <w:rPr>
-          <w:sz w:val="28"/>
-          <w:szCs w:val="28"/>
-          <w:highlight w:val="yellow"/>
+          <w:highlight w:val="green"/>
+        </w:rPr>
+        <w:t xml:space="preserve"> </w:t>
+      </w:r>
+      <w:proofErr w:type="spellStart"/>
+      <w:r>
+        <w:rPr>
+          <w:sz w:val="28"/>
+          <w:szCs w:val="28"/>
+          <w:highlight w:val="green"/>
         </w:rPr>
         <w:t>gleichen</w:t>
       </w:r>
@@ -10683,16 +10683,16 @@
         <w:rPr>
           <w:sz w:val="28"/>
           <w:szCs w:val="28"/>
-          <w:highlight w:val="yellow"/>
-        </w:rPr>
-        <w:t xml:space="preserve"> </w:t>
-      </w:r>
-      <w:proofErr w:type="spellStart"/>
-      <w:r>
-        <w:rPr>
-          <w:sz w:val="28"/>
-          <w:szCs w:val="28"/>
-          <w:highlight w:val="yellow"/>
+          <w:highlight w:val="green"/>
+        </w:rPr>
+        <w:t xml:space="preserve"> </w:t>
+      </w:r>
+      <w:proofErr w:type="spellStart"/>
+      <w:r>
+        <w:rPr>
+          <w:sz w:val="28"/>
+          <w:szCs w:val="28"/>
+          <w:highlight w:val="green"/>
         </w:rPr>
         <w:t>Ergebnissen</w:t>
       </w:r>
@@ -10701,16 +10701,16 @@
         <w:rPr>
           <w:sz w:val="28"/>
           <w:szCs w:val="28"/>
-          <w:highlight w:val="yellow"/>
-        </w:rPr>
-        <w:t xml:space="preserve"> </w:t>
-      </w:r>
-      <w:proofErr w:type="spellStart"/>
-      <w:r>
-        <w:rPr>
-          <w:sz w:val="28"/>
-          <w:szCs w:val="28"/>
-          <w:highlight w:val="yellow"/>
+          <w:highlight w:val="green"/>
+        </w:rPr>
+        <w:t xml:space="preserve"> </w:t>
+      </w:r>
+      <w:proofErr w:type="spellStart"/>
+      <w:r>
+        <w:rPr>
+          <w:sz w:val="28"/>
+          <w:szCs w:val="28"/>
+          <w:highlight w:val="green"/>
         </w:rPr>
         <w:t>reproduzieren</w:t>
       </w:r>
@@ -10719,16 +10719,16 @@
         <w:rPr>
           <w:sz w:val="28"/>
           <w:szCs w:val="28"/>
-          <w:highlight w:val="yellow"/>
-        </w:rPr>
-        <w:t xml:space="preserve"> </w:t>
-      </w:r>
-      <w:proofErr w:type="spellStart"/>
-      <w:r>
-        <w:rPr>
-          <w:sz w:val="28"/>
-          <w:szCs w:val="28"/>
-          <w:highlight w:val="yellow"/>
+          <w:highlight w:val="green"/>
+        </w:rPr>
+        <w:t xml:space="preserve"> </w:t>
+      </w:r>
+      <w:proofErr w:type="spellStart"/>
+      <w:r>
+        <w:rPr>
+          <w:sz w:val="28"/>
+          <w:szCs w:val="28"/>
+          <w:highlight w:val="green"/>
         </w:rPr>
         <w:t>kann</w:t>
       </w:r>
@@ -10737,7 +10737,7 @@
         <w:rPr>
           <w:sz w:val="28"/>
           <w:szCs w:val="28"/>
-          <w:highlight w:val="yellow"/>
+          <w:highlight w:val="green"/>
         </w:rPr>
         <w:t>.</w:t>
       </w:r>

</xml_diff>